<commit_message>
update report to include detailed analysis and conclusions on sorting algorithms; add acknowledgments and references
</commit_message>
<xml_diff>
--- a/AED_Vasco_a85234.docx
+++ b/AED_Vasco_a85234.docx
@@ -49,12 +49,12 @@
           <w:szCs w:val="28"/>
         </w:rPr>
         <w:sectPr>
-          <w:headerReference w:type="even" r:id="rId7"/>
-          <w:headerReference w:type="default" r:id="rId8"/>
-          <w:footerReference w:type="even" r:id="rId9"/>
-          <w:footerReference w:type="default" r:id="rId10"/>
-          <w:headerReference w:type="first" r:id="rId11"/>
-          <w:footerReference w:type="first" r:id="rId12"/>
+          <w:headerReference w:type="even" r:id="rId8"/>
+          <w:headerReference w:type="default" r:id="rId9"/>
+          <w:footerReference w:type="even" r:id="rId10"/>
+          <w:footerReference w:type="default" r:id="rId11"/>
+          <w:headerReference w:type="first" r:id="rId12"/>
+          <w:footerReference w:type="first" r:id="rId13"/>
           <w:footnotePr>
             <w:pos w:val="beneathText"/>
           </w:footnotePr>
@@ -1300,7 +1300,7 @@
     </w:p>
     <w:p>
       <w:r>
-        <w:t xml:space="preserve">Método. O tempo foi medido com </w:t>
+        <w:t xml:space="preserve">O tempo foi medido com </w:t>
       </w:r>
       <w:proofErr w:type="spellStart"/>
       <w:r>
@@ -1479,21 +1479,154 @@
       </w:pPr>
       <w:r>
         <w:lastRenderedPageBreak/>
-        <w:t>Conlusão</w:t>
-      </w:r>
-    </w:p>
-    <w:p>
-      <w:r>
-        <w:t xml:space="preserve">Método. O tempo foi medido com </w:t>
-      </w:r>
-      <w:proofErr w:type="spellStart"/>
-      <w:r>
-        <w:t>System.nanoTime</w:t>
-      </w:r>
-      <w:proofErr w:type="spellEnd"/>
-    </w:p>
+        <w:t>Conclusão</w:t>
+      </w:r>
+    </w:p>
+    <w:p>
+      <w:r>
+        <w:t>Até à resolução deste trabalho havia questões as quais não estava habituado a não ter uma resposta direta. Por exemplo, ordenar um vetor, ou ordenação no geral, torna-se banal até à necessidade de traduzir esse conceito para máquina de forma à mesma fazer o pretendido. Neste caso tem de ser especificado, não só a estrutura dos dados e o ficheiro que os contém, mas como também a tradução dos mesmos de forma a poderem ser manipulados, (neste caso com um foco mais virado para os ficheiros binários).</w:t>
+      </w:r>
+    </w:p>
+    <w:p>
+      <w:r>
+        <w:t xml:space="preserve">Foi notável as várias formas diferentes de ordenar valores e as suas diferenças de lógica, criatividade e eficiência. Com isto foi </w:t>
+      </w:r>
+    </w:p>
+    <w:p/>
+    <w:p>
+      <w:pPr>
+        <w:pStyle w:val="Ttulo1"/>
+      </w:pPr>
+      <w:r>
+        <w:t>Agradecimentos</w:t>
+      </w:r>
+    </w:p>
+    <w:p>
+      <w:r>
+        <w:t>Gostava de aproveitar a agradecer ao professor Roberto Lam pela prontidão e disponibilidade para com os alunos na resolução de problemas.</w:t>
+      </w:r>
+    </w:p>
+    <w:p/>
+    <w:sdt>
+      <w:sdtPr>
+        <w:id w:val="866485187"/>
+        <w:docPartObj>
+          <w:docPartGallery w:val="Bibliographies"/>
+          <w:docPartUnique/>
+        </w:docPartObj>
+      </w:sdtPr>
+      <w:sdtEndPr>
+        <w:rPr>
+          <w:rFonts w:ascii="Times New Roman" w:hAnsi="Times New Roman"/>
+          <w:b w:val="0"/>
+          <w:caps w:val="0"/>
+          <w:kern w:val="0"/>
+        </w:rPr>
+      </w:sdtEndPr>
+      <w:sdtContent>
+        <w:p>
+          <w:pPr>
+            <w:pStyle w:val="Ttulo1"/>
+          </w:pPr>
+          <w:r>
+            <w:t>Referências</w:t>
+          </w:r>
+        </w:p>
+        <w:sdt>
+          <w:sdtPr>
+            <w:id w:val="-573587230"/>
+            <w:bibliography/>
+          </w:sdtPr>
+          <w:sdtContent>
+            <w:p>
+              <w:pPr>
+                <w:pStyle w:val="Bibliografia"/>
+                <w:ind w:left="720" w:hanging="720"/>
+                <w:rPr>
+                  <w:noProof/>
+                  <w:sz w:val="24"/>
+                  <w:szCs w:val="24"/>
+                </w:rPr>
+              </w:pPr>
+              <w:r>
+                <w:fldChar w:fldCharType="begin"/>
+              </w:r>
+              <w:r>
+                <w:instrText>BIBLIOGRAPHY</w:instrText>
+              </w:r>
+              <w:r>
+                <w:fldChar w:fldCharType="separate"/>
+              </w:r>
+              <w:r>
+                <w:rPr>
+                  <w:noProof/>
+                </w:rPr>
+                <w:t>Lam, R. C. (s.d.). Aula PL4 e TI.</w:t>
+              </w:r>
+            </w:p>
+            <w:p>
+              <w:pPr>
+                <w:pStyle w:val="Bibliografia"/>
+                <w:ind w:left="720" w:hanging="720"/>
+                <w:rPr>
+                  <w:noProof/>
+                  <w:lang w:val="en-US"/>
+                </w:rPr>
+              </w:pPr>
+              <w:r>
+                <w:rPr>
+                  <w:noProof/>
+                  <w:lang w:val="en-US"/>
+                </w:rPr>
+                <w:t>Lam, R. C. (s.d.). POO_JavaStreams.</w:t>
+              </w:r>
+            </w:p>
+            <w:p>
+              <w:pPr>
+                <w:pStyle w:val="Bibliografia"/>
+                <w:ind w:left="720" w:hanging="720"/>
+                <w:rPr>
+                  <w:noProof/>
+                </w:rPr>
+              </w:pPr>
+              <w:r>
+                <w:rPr>
+                  <w:noProof/>
+                </w:rPr>
+                <w:t>Lam, R. C. (s.d.). Programação Orientada a objetos.</w:t>
+              </w:r>
+            </w:p>
+            <w:p>
+              <w:pPr>
+                <w:pStyle w:val="Bibliografia"/>
+                <w:ind w:left="720" w:hanging="720"/>
+                <w:rPr>
+                  <w:noProof/>
+                </w:rPr>
+              </w:pPr>
+              <w:r>
+                <w:rPr>
+                  <w:noProof/>
+                </w:rPr>
+                <w:t>Lam, R. C. (s.d.). Programação Orientada a Objetos (2).</w:t>
+              </w:r>
+            </w:p>
+            <w:p>
+              <w:r>
+                <w:rPr>
+                  <w:b/>
+                  <w:bCs/>
+                </w:rPr>
+                <w:fldChar w:fldCharType="end"/>
+              </w:r>
+            </w:p>
+          </w:sdtContent>
+        </w:sdt>
+      </w:sdtContent>
+    </w:sdt>
+    <w:p/>
     <w:sectPr>
-      <w:headerReference w:type="even" r:id="rId13"/>
+      <w:headerReference w:type="even" r:id="rId14"/>
       <w:footnotePr>
         <w:pos w:val="beneathText"/>
       </w:footnotePr>
@@ -3161,6 +3294,8 @@
     <w:name w:val="heading 1"/>
     <w:basedOn w:val="Normal"/>
     <w:next w:val="Normal"/>
+    <w:link w:val="Ttulo1Carter"/>
+    <w:uiPriority w:val="9"/>
     <w:qFormat/>
     <w:pPr>
       <w:keepNext/>
@@ -3317,6 +3452,7 @@
   <w:style w:type="character" w:default="1" w:styleId="Tipodeletrapredefinidodopargrafo">
     <w:name w:val="Default Paragraph Font"/>
     <w:uiPriority w:val="1"/>
+    <w:semiHidden/>
     <w:unhideWhenUsed/>
   </w:style>
   <w:style w:type="table" w:default="1" w:styleId="Tabelanormal">
@@ -4091,6 +4227,27 @@
       <w:ind w:left="720"/>
       <w:contextualSpacing/>
     </w:pPr>
+  </w:style>
+  <w:style w:type="character" w:customStyle="1" w:styleId="Ttulo1Carter">
+    <w:name w:val="Título 1 Caráter"/>
+    <w:basedOn w:val="Tipodeletrapredefinidodopargrafo"/>
+    <w:link w:val="Ttulo1"/>
+    <w:uiPriority w:val="9"/>
+    <w:rsid w:val="00705A2C"/>
+    <w:rPr>
+      <w:rFonts w:ascii="Helvetica" w:hAnsi="Helvetica"/>
+      <w:b/>
+      <w:caps/>
+      <w:kern w:val="28"/>
+      <w:lang w:eastAsia="en-US"/>
+    </w:rPr>
+  </w:style>
+  <w:style w:type="paragraph" w:styleId="Bibliografia">
+    <w:name w:val="Bibliography"/>
+    <w:basedOn w:val="Normal"/>
+    <w:next w:val="Normal"/>
+    <w:uiPriority w:val="70"/>
+    <w:rsid w:val="00705A2C"/>
   </w:style>
 </w:styles>
 </file>
@@ -4408,4 +4565,89 @@
     </a:ext>
   </a:extLst>
 </a:theme>
+</file>
+
+<file path=customXml/item1.xml><?xml version="1.0" encoding="utf-8"?>
+<b:Sources xmlns:b="http://schemas.openxmlformats.org/officeDocument/2006/bibliography" xmlns="http://schemas.openxmlformats.org/officeDocument/2006/bibliography" SelectedStyle="\APASixthEditionOfficeOnline.xsl" StyleName="APA" Version="6">
+  <b:Source>
+    <b:Tag>Rob</b:Tag>
+    <b:SourceType>ElectronicSource</b:SourceType>
+    <b:Guid>{C0C88F95-F0C1-4656-8DC6-8AFC26E9521C}</b:Guid>
+    <b:Title>Programação Orientada a objetos</b:Title>
+    <b:Author>
+      <b:Author>
+        <b:NameList>
+          <b:Person>
+            <b:Last>Lam</b:Last>
+            <b:First>Roberto</b:First>
+            <b:Middle>Célio Lau</b:Middle>
+          </b:Person>
+        </b:NameList>
+      </b:Author>
+    </b:Author>
+    <b:RefOrder>1</b:RefOrder>
+  </b:Source>
+  <b:Source>
+    <b:Tag>Rob1</b:Tag>
+    <b:SourceType>ElectronicSource</b:SourceType>
+    <b:Guid>{AA78DE5B-36FA-47BA-95E7-A388AFBB7CBD}</b:Guid>
+    <b:Author>
+      <b:Author>
+        <b:NameList>
+          <b:Person>
+            <b:Last>Lam</b:Last>
+            <b:First>Roberto</b:First>
+            <b:Middle>Célio Lau</b:Middle>
+          </b:Person>
+        </b:NameList>
+      </b:Author>
+    </b:Author>
+    <b:Title>Programação Orientada a Objetos (2)</b:Title>
+    <b:RefOrder>2</b:RefOrder>
+  </b:Source>
+  <b:Source>
+    <b:Tag>Rob2</b:Tag>
+    <b:SourceType>ElectronicSource</b:SourceType>
+    <b:Guid>{11B06F78-804D-40EC-B9A8-009E06B63288}</b:Guid>
+    <b:Author>
+      <b:Author>
+        <b:NameList>
+          <b:Person>
+            <b:Last>Lam</b:Last>
+            <b:First>Roberto</b:First>
+            <b:Middle>Célio Lau</b:Middle>
+          </b:Person>
+        </b:NameList>
+      </b:Author>
+    </b:Author>
+    <b:Title>POO_JavaStreams</b:Title>
+    <b:RefOrder>3</b:RefOrder>
+  </b:Source>
+  <b:Source>
+    <b:Tag>Rob3</b:Tag>
+    <b:SourceType>ElectronicSource</b:SourceType>
+    <b:Guid>{15987B39-4FC4-4C73-A304-73F6BBB65DF1}</b:Guid>
+    <b:Author>
+      <b:Author>
+        <b:NameList>
+          <b:Person>
+            <b:Last>Lam</b:Last>
+            <b:First>Roberto</b:First>
+            <b:Middle>Célio Lau</b:Middle>
+          </b:Person>
+        </b:NameList>
+      </b:Author>
+    </b:Author>
+    <b:Title>Aula PL4 e TI</b:Title>
+    <b:RefOrder>4</b:RefOrder>
+  </b:Source>
+</b:Sources>
+</file>
+
+<file path=customXml/itemProps1.xml><?xml version="1.0" encoding="utf-8"?>
+<ds:datastoreItem xmlns:ds="http://schemas.openxmlformats.org/officeDocument/2006/customXml" ds:itemID="{920BF2A1-1CF5-4117-9ECA-928BFBA643E2}">
+  <ds:schemaRefs>
+    <ds:schemaRef ds:uri="http://schemas.openxmlformats.org/officeDocument/2006/bibliography"/>
+  </ds:schemaRefs>
+</ds:datastoreItem>
 </file>
</xml_diff>

<commit_message>
add PDF report on sorting algorithms and update README with repository link
</commit_message>
<xml_diff>
--- a/AED_Vasco_a85234.docx
+++ b/AED_Vasco_a85234.docx
@@ -209,7 +209,19 @@
         <w:rPr>
           <w:i/>
         </w:rPr>
-        <w:t>ordenação em JAVA que recebe um ficheiro numérico em formato texto (.</w:t>
+        <w:t xml:space="preserve">ordenação em </w:t>
+      </w:r>
+      <w:r>
+        <w:rPr>
+          <w:i/>
+        </w:rPr>
+        <w:t xml:space="preserve">java </w:t>
+      </w:r>
+      <w:r>
+        <w:rPr>
+          <w:i/>
+        </w:rPr>
+        <w:t>que recebe um ficheiro numérico em formato texto (.</w:t>
       </w:r>
       <w:proofErr w:type="spellStart"/>
       <w:r>
@@ -229,7 +241,33 @@
         <w:rPr>
           <w:i/>
         </w:rPr>
-        <w:t>binário e ordena exportando num novo ficheiro os valores ordenados</w:t>
+        <w:t xml:space="preserve">binário e </w:t>
+      </w:r>
+      <w:proofErr w:type="gramStart"/>
+      <w:r>
+        <w:rPr>
+          <w:i/>
+        </w:rPr>
+        <w:t xml:space="preserve">ordena </w:t>
+      </w:r>
+      <w:r>
+        <w:rPr>
+          <w:i/>
+        </w:rPr>
+        <w:t>grava</w:t>
+      </w:r>
+      <w:proofErr w:type="gramEnd"/>
+      <w:r>
+        <w:rPr>
+          <w:i/>
+        </w:rPr>
+        <w:t xml:space="preserve"> os valores </w:t>
+      </w:r>
+      <w:r>
+        <w:rPr>
+          <w:i/>
+        </w:rPr>
+        <w:t>num novo ficheiro</w:t>
       </w:r>
       <w:r>
         <w:rPr>
@@ -287,7 +325,13 @@
       </w:r>
       <w:proofErr w:type="spellEnd"/>
       <w:r>
-        <w:t xml:space="preserve"> juntamente de um repositório </w:t>
+        <w:t xml:space="preserve"> juntamente </w:t>
+      </w:r>
+      <w:r>
+        <w:t>com</w:t>
+      </w:r>
+      <w:r>
+        <w:t xml:space="preserve"> um repositório </w:t>
       </w:r>
       <w:proofErr w:type="spellStart"/>
       <w:r>
@@ -295,7 +339,19 @@
       </w:r>
       <w:proofErr w:type="spellEnd"/>
       <w:r>
-        <w:t>. Java foi a linguajem utilizada. Como ficheiros de entrada foi utilizado ficheiros de texto e em formato binário. O formato de texto tornou-se mais simples de visualizar e projetar a lógica de ordenação, por outro lado o formato binário é mais universal e essencial para aprendizagem e aplicabilidade no mundo real. Os algoritmos de ordenação utilizados</w:t>
+        <w:t>. Java foi a lingua</w:t>
+      </w:r>
+      <w:r>
+        <w:t>g</w:t>
+      </w:r>
+      <w:r>
+        <w:t>em utilizada. Como ficheiros de entrada</w:t>
+      </w:r>
+      <w:r>
+        <w:t>,</w:t>
+      </w:r>
+      <w:r>
+        <w:t xml:space="preserve"> foi utilizado ficheiros de texto e em formato binário. O formato de texto tornou-se mais simples de visualizar e projetar a lógica de ordenação, por outro lado o formato binário é mais universal e essencial para aprendizagem e aplicabilidade no mundo real. Os algoritmos de ordenação utilizados</w:t>
       </w:r>
       <w:r>
         <w:t xml:space="preserve"> </w:t>
@@ -470,10 +526,7 @@
         <w:t>media,</w:t>
       </w:r>
       <w:r>
-        <w:t xml:space="preserve"> mas suficiente para a maioria das utilizações com eficiência geral de O(n^2). Como referido anteriormente, o seu funcionamento baseia-se na comparação entre o valor do comparando ao seu comparador. No caso de o primeiro ser maior que o seguindo há a troca de posições. </w:t>
-      </w:r>
-      <w:r>
-        <w:t>Este processo repete-se até todas as comparações serem verdadeiras.</w:t>
+        <w:t xml:space="preserve"> mas suficiente para a maioria das utilizações com eficiência geral de O(n^2). Como referido anteriormente, o seu funcionamento baseia-se na comparação entre o valor do comparando ao seu comparador. No caso de o primeiro ser maior que o seguindo há a troca de posições. Este processo repete-se até todas as comparações serem verdadeiras.</w:t>
       </w:r>
     </w:p>
     <w:p>
@@ -583,7 +636,16 @@
         <w:t xml:space="preserve">O programa implementado </w:t>
       </w:r>
       <w:r>
-        <w:t>lê um ficheiro de inteiros, ordena-os em memória e grava o resultado num novo ficheiro em outputs/, com o mesmo formato da entrada</w:t>
+        <w:t xml:space="preserve">lê um ficheiro de inteiros, ordena-os em memória e grava o resultado num novo ficheiro em outputs/, com o </w:t>
+      </w:r>
+      <w:r>
+        <w:rPr>
+          <w:u w:val="single"/>
+        </w:rPr>
+        <w:t>mesmo</w:t>
+      </w:r>
+      <w:r>
+        <w:t xml:space="preserve"> formato da entrada</w:t>
       </w:r>
       <w:r>
         <w:t>.</w:t>
@@ -643,36 +705,36 @@
         </w:numPr>
       </w:pPr>
       <w:r>
+        <w:t xml:space="preserve">Java </w:t>
+      </w:r>
+      <w:proofErr w:type="spellStart"/>
+      <w:proofErr w:type="gramStart"/>
+      <w:r>
+        <w:t>algoritmos.Main</w:t>
+      </w:r>
+      <w:proofErr w:type="spellEnd"/>
+      <w:proofErr w:type="gramEnd"/>
+      <w:r>
+        <w:t xml:space="preserve"> (nome ficheiro </w:t>
+      </w:r>
+      <w:r>
+        <w:t xml:space="preserve">a ordenar) (algoritmo de ordenação, escolha entre os referidos </w:t>
+      </w:r>
+      <w:proofErr w:type="spellStart"/>
+      <w:r>
+        <w:t>antreormente</w:t>
+      </w:r>
+      <w:proofErr w:type="spellEnd"/>
+      <w:r>
+        <w:t>)</w:t>
+      </w:r>
+    </w:p>
+    <w:p>
+      <w:pPr>
+        <w:ind w:left="360"/>
+      </w:pPr>
+      <w:r>
         <w:lastRenderedPageBreak/>
-        <w:t xml:space="preserve">Java </w:t>
-      </w:r>
-      <w:proofErr w:type="spellStart"/>
-      <w:proofErr w:type="gramStart"/>
-      <w:r>
-        <w:t>algoritmos.Main</w:t>
-      </w:r>
-      <w:proofErr w:type="spellEnd"/>
-      <w:proofErr w:type="gramEnd"/>
-      <w:r>
-        <w:t xml:space="preserve"> (nome ficheiro </w:t>
-      </w:r>
-      <w:r>
-        <w:t xml:space="preserve">a ordenar) (algoritmo de ordenação, escolha entre os referidos </w:t>
-      </w:r>
-      <w:proofErr w:type="spellStart"/>
-      <w:r>
-        <w:t>antreormente</w:t>
-      </w:r>
-      <w:proofErr w:type="spellEnd"/>
-      <w:r>
-        <w:t>)</w:t>
-      </w:r>
-    </w:p>
-    <w:p>
-      <w:pPr>
-        <w:ind w:left="360"/>
-      </w:pPr>
-      <w:r>
         <w:t>Estes comandos têm de ser corridos estando dentro da pasta “TP1_AED_a85234”.</w:t>
       </w:r>
     </w:p>
@@ -1027,10 +1089,7 @@
       </w:r>
       <w:proofErr w:type="spellEnd"/>
       <w:r>
-        <w:t xml:space="preserve"> e binários: Ler um ficheiro e informar </w:t>
-      </w:r>
-      <w:r>
-        <w:t>quantos valores estão no ficheiro .</w:t>
+        <w:t xml:space="preserve"> e binários: Ler um ficheiro e informar quantos valores estão no ficheiro .</w:t>
       </w:r>
       <w:proofErr w:type="spellStart"/>
       <w:r>
@@ -1054,7 +1113,10 @@
       </w:r>
       <w:proofErr w:type="spellEnd"/>
       <w:r>
-        <w:t xml:space="preserve">, verificar quantas linhas estão preenchidas e devolver esse valor. Para binário é recolhido o </w:t>
+        <w:t xml:space="preserve">, verificar quantas linhas estão preenchidas e devolver </w:t>
+      </w:r>
+      <w:r>
+        <w:t xml:space="preserve">esse valor. Para binário é recolhido o </w:t>
       </w:r>
       <w:proofErr w:type="gramStart"/>
       <w:r>
@@ -1478,21 +1540,142 @@
         <w:pStyle w:val="Ttulo1"/>
       </w:pPr>
       <w:r>
+        <w:t>Conclusão</w:t>
+      </w:r>
+    </w:p>
+    <w:p>
+      <w:r>
+        <w:t xml:space="preserve">Até à resolução deste trabalho havia questões as quais não estava habituado a não ter uma resposta direta. Por exemplo, ordenar um vetor, ou ordenação no geral, torna-se banal até à necessidade de traduzir esse conceito para </w:t>
+      </w:r>
+      <w:r>
         <w:lastRenderedPageBreak/>
-        <w:t>Conclusão</w:t>
-      </w:r>
-    </w:p>
-    <w:p>
-      <w:r>
-        <w:t>Até à resolução deste trabalho havia questões as quais não estava habituado a não ter uma resposta direta. Por exemplo, ordenar um vetor, ou ordenação no geral, torna-se banal até à necessidade de traduzir esse conceito para máquina de forma à mesma fazer o pretendido. Neste caso tem de ser especificado, não só a estrutura dos dados e o ficheiro que os contém, mas como também a tradução dos mesmos de forma a poderem ser manipulados, (neste caso com um foco mais virado para os ficheiros binários).</w:t>
-      </w:r>
-    </w:p>
-    <w:p>
-      <w:r>
-        <w:t xml:space="preserve">Foi notável as várias formas diferentes de ordenar valores e as suas diferenças de lógica, criatividade e eficiência. Com isto foi </w:t>
-      </w:r>
-    </w:p>
-    <w:p/>
+        <w:t>máquina de forma à mesma fazer o pretendido. Neste caso tem de ser especificado, não só a estrutura dos dados e o ficheiro que os contém, mas como também a tradução dos mesmos de forma a poderem ser manipulados, (neste caso com um foco mais virado para os ficheiros binários).</w:t>
+      </w:r>
+    </w:p>
+    <w:p>
+      <w:r>
+        <w:t>Foi notável as várias formas diferentes de ordenar valores e as suas diferenças de lógica, criatividade e eficiência. Com isto</w:t>
+      </w:r>
+      <w:r>
+        <w:t>,</w:t>
+      </w:r>
+      <w:r>
+        <w:t xml:space="preserve"> foi </w:t>
+      </w:r>
+      <w:r>
+        <w:t>verificado a seguinte performance ao ordenar 5000 valores:</w:t>
+      </w:r>
+    </w:p>
+    <w:p>
+      <w:pPr>
+        <w:pStyle w:val="PargrafodaLista"/>
+        <w:numPr>
+          <w:ilvl w:val="0"/>
+          <w:numId w:val="45"/>
+        </w:numPr>
+        <w:rPr>
+          <w:lang w:val="en-US"/>
+        </w:rPr>
+      </w:pPr>
+      <w:proofErr w:type="spellStart"/>
+      <w:r>
+        <w:rPr>
+          <w:lang w:val="en-US"/>
+        </w:rPr>
+        <w:t>Bubblesort</w:t>
+      </w:r>
+      <w:proofErr w:type="spellEnd"/>
+      <w:r>
+        <w:rPr>
+          <w:lang w:val="en-US"/>
+        </w:rPr>
+        <w:t xml:space="preserve">: 56,26 </w:t>
+      </w:r>
+      <w:proofErr w:type="spellStart"/>
+      <w:r>
+        <w:rPr>
+          <w:lang w:val="en-US"/>
+        </w:rPr>
+        <w:t>ms</w:t>
+      </w:r>
+      <w:proofErr w:type="spellEnd"/>
+    </w:p>
+    <w:p>
+      <w:pPr>
+        <w:pStyle w:val="PargrafodaLista"/>
+        <w:numPr>
+          <w:ilvl w:val="0"/>
+          <w:numId w:val="45"/>
+        </w:numPr>
+        <w:rPr>
+          <w:lang w:val="en-US"/>
+        </w:rPr>
+      </w:pPr>
+      <w:r>
+        <w:rPr>
+          <w:lang w:val="en-US"/>
+        </w:rPr>
+        <w:t xml:space="preserve">Insertion sort: 31,29 </w:t>
+      </w:r>
+      <w:proofErr w:type="spellStart"/>
+      <w:r>
+        <w:rPr>
+          <w:lang w:val="en-US"/>
+        </w:rPr>
+        <w:t>ms</w:t>
+      </w:r>
+      <w:proofErr w:type="spellEnd"/>
+    </w:p>
+    <w:p>
+      <w:pPr>
+        <w:pStyle w:val="PargrafodaLista"/>
+        <w:numPr>
+          <w:ilvl w:val="0"/>
+          <w:numId w:val="45"/>
+        </w:numPr>
+        <w:rPr>
+          <w:lang w:val="en-US"/>
+        </w:rPr>
+      </w:pPr>
+      <w:r>
+        <w:rPr>
+          <w:lang w:val="en-US"/>
+        </w:rPr>
+        <w:t xml:space="preserve">Quicksort: 24,02 </w:t>
+      </w:r>
+      <w:proofErr w:type="spellStart"/>
+      <w:r>
+        <w:rPr>
+          <w:lang w:val="en-US"/>
+        </w:rPr>
+        <w:t>ms</w:t>
+      </w:r>
+      <w:proofErr w:type="spellEnd"/>
+    </w:p>
+    <w:p>
+      <w:r>
+        <w:t xml:space="preserve">Verificando uma maior rapidez </w:t>
+      </w:r>
+      <w:r>
+        <w:t xml:space="preserve">na utilização do </w:t>
+      </w:r>
+      <w:proofErr w:type="spellStart"/>
+      <w:r>
+        <w:t>Quick</w:t>
+      </w:r>
+      <w:proofErr w:type="spellEnd"/>
+      <w:r>
+        <w:t xml:space="preserve"> </w:t>
+      </w:r>
+      <w:proofErr w:type="spellStart"/>
+      <w:r>
+        <w:t>Sort</w:t>
+      </w:r>
+      <w:proofErr w:type="spellEnd"/>
+      <w:r>
+        <w:t>.</w:t>
+      </w:r>
+    </w:p>
     <w:p>
       <w:pPr>
         <w:pStyle w:val="Ttulo1"/>
@@ -1509,20 +1692,18 @@
     <w:p/>
     <w:sdt>
       <w:sdtPr>
+        <w:rPr>
+          <w:rFonts w:ascii="Times New Roman" w:hAnsi="Times New Roman"/>
+          <w:b w:val="0"/>
+          <w:caps w:val="0"/>
+          <w:kern w:val="0"/>
+        </w:rPr>
         <w:id w:val="866485187"/>
         <w:docPartObj>
           <w:docPartGallery w:val="Bibliographies"/>
           <w:docPartUnique/>
         </w:docPartObj>
       </w:sdtPr>
-      <w:sdtEndPr>
-        <w:rPr>
-          <w:rFonts w:ascii="Times New Roman" w:hAnsi="Times New Roman"/>
-          <w:b w:val="0"/>
-          <w:caps w:val="0"/>
-          <w:kern w:val="0"/>
-        </w:rPr>
-      </w:sdtEndPr>
       <w:sdtContent>
         <w:p>
           <w:pPr>
@@ -2572,6 +2753,119 @@
     </w:lvl>
   </w:abstractNum>
   <w:abstractNum w:abstractNumId="33" w15:restartNumberingAfterBreak="0">
+    <w:nsid w:val="5A5547FA"/>
+    <w:multiLevelType w:val="hybridMultilevel"/>
+    <w:tmpl w:val="1CB46912"/>
+    <w:lvl w:ilvl="0" w:tplc="08160001">
+      <w:start w:val="1"/>
+      <w:numFmt w:val="bullet"/>
+      <w:lvlText w:val=""/>
+      <w:lvlJc w:val="left"/>
+      <w:pPr>
+        <w:ind w:left="720" w:hanging="360"/>
+      </w:pPr>
+      <w:rPr>
+        <w:rFonts w:ascii="Symbol" w:hAnsi="Symbol" w:hint="default"/>
+      </w:rPr>
+    </w:lvl>
+    <w:lvl w:ilvl="1" w:tplc="08160003" w:tentative="1">
+      <w:start w:val="1"/>
+      <w:numFmt w:val="bullet"/>
+      <w:lvlText w:val="o"/>
+      <w:lvlJc w:val="left"/>
+      <w:pPr>
+        <w:ind w:left="1440" w:hanging="360"/>
+      </w:pPr>
+      <w:rPr>
+        <w:rFonts w:ascii="Courier New" w:hAnsi="Courier New" w:cs="Courier New" w:hint="default"/>
+      </w:rPr>
+    </w:lvl>
+    <w:lvl w:ilvl="2" w:tplc="08160005" w:tentative="1">
+      <w:start w:val="1"/>
+      <w:numFmt w:val="bullet"/>
+      <w:lvlText w:val=""/>
+      <w:lvlJc w:val="left"/>
+      <w:pPr>
+        <w:ind w:left="2160" w:hanging="360"/>
+      </w:pPr>
+      <w:rPr>
+        <w:rFonts w:ascii="Wingdings" w:hAnsi="Wingdings" w:hint="default"/>
+      </w:rPr>
+    </w:lvl>
+    <w:lvl w:ilvl="3" w:tplc="08160001" w:tentative="1">
+      <w:start w:val="1"/>
+      <w:numFmt w:val="bullet"/>
+      <w:lvlText w:val=""/>
+      <w:lvlJc w:val="left"/>
+      <w:pPr>
+        <w:ind w:left="2880" w:hanging="360"/>
+      </w:pPr>
+      <w:rPr>
+        <w:rFonts w:ascii="Symbol" w:hAnsi="Symbol" w:hint="default"/>
+      </w:rPr>
+    </w:lvl>
+    <w:lvl w:ilvl="4" w:tplc="08160003" w:tentative="1">
+      <w:start w:val="1"/>
+      <w:numFmt w:val="bullet"/>
+      <w:lvlText w:val="o"/>
+      <w:lvlJc w:val="left"/>
+      <w:pPr>
+        <w:ind w:left="3600" w:hanging="360"/>
+      </w:pPr>
+      <w:rPr>
+        <w:rFonts w:ascii="Courier New" w:hAnsi="Courier New" w:cs="Courier New" w:hint="default"/>
+      </w:rPr>
+    </w:lvl>
+    <w:lvl w:ilvl="5" w:tplc="08160005" w:tentative="1">
+      <w:start w:val="1"/>
+      <w:numFmt w:val="bullet"/>
+      <w:lvlText w:val=""/>
+      <w:lvlJc w:val="left"/>
+      <w:pPr>
+        <w:ind w:left="4320" w:hanging="360"/>
+      </w:pPr>
+      <w:rPr>
+        <w:rFonts w:ascii="Wingdings" w:hAnsi="Wingdings" w:hint="default"/>
+      </w:rPr>
+    </w:lvl>
+    <w:lvl w:ilvl="6" w:tplc="08160001" w:tentative="1">
+      <w:start w:val="1"/>
+      <w:numFmt w:val="bullet"/>
+      <w:lvlText w:val=""/>
+      <w:lvlJc w:val="left"/>
+      <w:pPr>
+        <w:ind w:left="5040" w:hanging="360"/>
+      </w:pPr>
+      <w:rPr>
+        <w:rFonts w:ascii="Symbol" w:hAnsi="Symbol" w:hint="default"/>
+      </w:rPr>
+    </w:lvl>
+    <w:lvl w:ilvl="7" w:tplc="08160003" w:tentative="1">
+      <w:start w:val="1"/>
+      <w:numFmt w:val="bullet"/>
+      <w:lvlText w:val="o"/>
+      <w:lvlJc w:val="left"/>
+      <w:pPr>
+        <w:ind w:left="5760" w:hanging="360"/>
+      </w:pPr>
+      <w:rPr>
+        <w:rFonts w:ascii="Courier New" w:hAnsi="Courier New" w:cs="Courier New" w:hint="default"/>
+      </w:rPr>
+    </w:lvl>
+    <w:lvl w:ilvl="8" w:tplc="08160005" w:tentative="1">
+      <w:start w:val="1"/>
+      <w:numFmt w:val="bullet"/>
+      <w:lvlText w:val=""/>
+      <w:lvlJc w:val="left"/>
+      <w:pPr>
+        <w:ind w:left="6480" w:hanging="360"/>
+      </w:pPr>
+      <w:rPr>
+        <w:rFonts w:ascii="Wingdings" w:hAnsi="Wingdings" w:hint="default"/>
+      </w:rPr>
+    </w:lvl>
+  </w:abstractNum>
+  <w:abstractNum w:abstractNumId="34" w15:restartNumberingAfterBreak="0">
     <w:nsid w:val="5A856A6B"/>
     <w:multiLevelType w:val="singleLevel"/>
     <w:tmpl w:val="0C09000F"/>
@@ -2588,7 +2882,7 @@
       </w:pPr>
     </w:lvl>
   </w:abstractNum>
-  <w:abstractNum w:abstractNumId="34" w15:restartNumberingAfterBreak="0">
+  <w:abstractNum w:abstractNumId="35" w15:restartNumberingAfterBreak="0">
     <w:nsid w:val="5C2D790C"/>
     <w:multiLevelType w:val="singleLevel"/>
     <w:tmpl w:val="C5B65A8C"/>
@@ -2603,7 +2897,7 @@
       </w:pPr>
     </w:lvl>
   </w:abstractNum>
-  <w:abstractNum w:abstractNumId="35" w15:restartNumberingAfterBreak="0">
+  <w:abstractNum w:abstractNumId="36" w15:restartNumberingAfterBreak="0">
     <w:nsid w:val="5F620B59"/>
     <w:multiLevelType w:val="singleLevel"/>
     <w:tmpl w:val="F79013B8"/>
@@ -2618,7 +2912,7 @@
       </w:pPr>
     </w:lvl>
   </w:abstractNum>
-  <w:abstractNum w:abstractNumId="36" w15:restartNumberingAfterBreak="0">
+  <w:abstractNum w:abstractNumId="37" w15:restartNumberingAfterBreak="0">
     <w:nsid w:val="5FEC26F4"/>
     <w:multiLevelType w:val="singleLevel"/>
     <w:tmpl w:val="54D2849A"/>
@@ -2633,7 +2927,7 @@
       </w:pPr>
     </w:lvl>
   </w:abstractNum>
-  <w:abstractNum w:abstractNumId="37" w15:restartNumberingAfterBreak="0">
+  <w:abstractNum w:abstractNumId="38" w15:restartNumberingAfterBreak="0">
     <w:nsid w:val="67B02AEB"/>
     <w:multiLevelType w:val="singleLevel"/>
     <w:tmpl w:val="C5B65A8C"/>
@@ -2648,7 +2942,7 @@
       </w:pPr>
     </w:lvl>
   </w:abstractNum>
-  <w:abstractNum w:abstractNumId="38" w15:restartNumberingAfterBreak="0">
+  <w:abstractNum w:abstractNumId="39" w15:restartNumberingAfterBreak="0">
     <w:nsid w:val="6AD542B3"/>
     <w:multiLevelType w:val="singleLevel"/>
     <w:tmpl w:val="C5B65A8C"/>
@@ -2663,7 +2957,7 @@
       </w:pPr>
     </w:lvl>
   </w:abstractNum>
-  <w:abstractNum w:abstractNumId="39" w15:restartNumberingAfterBreak="0">
+  <w:abstractNum w:abstractNumId="40" w15:restartNumberingAfterBreak="0">
     <w:nsid w:val="6BC122F1"/>
     <w:multiLevelType w:val="singleLevel"/>
     <w:tmpl w:val="C5B65A8C"/>
@@ -2678,7 +2972,7 @@
       </w:pPr>
     </w:lvl>
   </w:abstractNum>
-  <w:abstractNum w:abstractNumId="40" w15:restartNumberingAfterBreak="0">
+  <w:abstractNum w:abstractNumId="41" w15:restartNumberingAfterBreak="0">
     <w:nsid w:val="6FE97D62"/>
     <w:multiLevelType w:val="singleLevel"/>
     <w:tmpl w:val="0C09000F"/>
@@ -2695,7 +2989,7 @@
       </w:pPr>
     </w:lvl>
   </w:abstractNum>
-  <w:abstractNum w:abstractNumId="41" w15:restartNumberingAfterBreak="0">
+  <w:abstractNum w:abstractNumId="42" w15:restartNumberingAfterBreak="0">
     <w:nsid w:val="77C17312"/>
     <w:multiLevelType w:val="singleLevel"/>
     <w:tmpl w:val="BA1E8B60"/>
@@ -2710,7 +3004,7 @@
       </w:pPr>
     </w:lvl>
   </w:abstractNum>
-  <w:abstractNum w:abstractNumId="42" w15:restartNumberingAfterBreak="0">
+  <w:abstractNum w:abstractNumId="43" w15:restartNumberingAfterBreak="0">
     <w:nsid w:val="790F1594"/>
     <w:multiLevelType w:val="singleLevel"/>
     <w:tmpl w:val="EADA5534"/>
@@ -2725,7 +3019,7 @@
       </w:pPr>
     </w:lvl>
   </w:abstractNum>
-  <w:abstractNum w:abstractNumId="43" w15:restartNumberingAfterBreak="0">
+  <w:abstractNum w:abstractNumId="44" w15:restartNumberingAfterBreak="0">
     <w:nsid w:val="7D1443CA"/>
     <w:multiLevelType w:val="singleLevel"/>
     <w:tmpl w:val="C72EC1CC"/>
@@ -2753,7 +3047,7 @@
     <w:abstractNumId w:val="15"/>
   </w:num>
   <w:num w:numId="5" w16cid:durableId="1467042132">
-    <w:abstractNumId w:val="39"/>
+    <w:abstractNumId w:val="40"/>
   </w:num>
   <w:num w:numId="6" w16cid:durableId="1661421837">
     <w:abstractNumId w:val="10"/>
@@ -2780,19 +3074,19 @@
     <w:abstractNumId w:val="23"/>
   </w:num>
   <w:num w:numId="9" w16cid:durableId="1998920612">
-    <w:abstractNumId w:val="37"/>
+    <w:abstractNumId w:val="38"/>
   </w:num>
   <w:num w:numId="10" w16cid:durableId="134642587">
-    <w:abstractNumId w:val="34"/>
+    <w:abstractNumId w:val="35"/>
   </w:num>
   <w:num w:numId="11" w16cid:durableId="1303922612">
-    <w:abstractNumId w:val="41"/>
+    <w:abstractNumId w:val="42"/>
   </w:num>
   <w:num w:numId="12" w16cid:durableId="2048480152">
     <w:abstractNumId w:val="25"/>
   </w:num>
   <w:num w:numId="13" w16cid:durableId="1133908560">
-    <w:abstractNumId w:val="38"/>
+    <w:abstractNumId w:val="39"/>
   </w:num>
   <w:num w:numId="14" w16cid:durableId="1234780155">
     <w:abstractNumId w:val="27"/>
@@ -2801,10 +3095,10 @@
     <w:abstractNumId w:val="21"/>
   </w:num>
   <w:num w:numId="16" w16cid:durableId="1902322357">
-    <w:abstractNumId w:val="35"/>
+    <w:abstractNumId w:val="36"/>
   </w:num>
   <w:num w:numId="17" w16cid:durableId="567619247">
-    <w:abstractNumId w:val="36"/>
+    <w:abstractNumId w:val="37"/>
   </w:num>
   <w:num w:numId="18" w16cid:durableId="804009600">
     <w:abstractNumId w:val="29"/>
@@ -2819,13 +3113,13 @@
     <w:abstractNumId w:val="32"/>
   </w:num>
   <w:num w:numId="22" w16cid:durableId="591359678">
-    <w:abstractNumId w:val="43"/>
+    <w:abstractNumId w:val="44"/>
   </w:num>
   <w:num w:numId="23" w16cid:durableId="788469416">
     <w:abstractNumId w:val="16"/>
   </w:num>
   <w:num w:numId="24" w16cid:durableId="1308777022">
-    <w:abstractNumId w:val="42"/>
+    <w:abstractNumId w:val="43"/>
   </w:num>
   <w:num w:numId="25" w16cid:durableId="1304580252">
     <w:abstractNumId w:val="20"/>
@@ -2846,13 +3140,13 @@
     <w:abstractNumId w:val="19"/>
   </w:num>
   <w:num w:numId="31" w16cid:durableId="1697851092">
-    <w:abstractNumId w:val="40"/>
+    <w:abstractNumId w:val="41"/>
   </w:num>
   <w:num w:numId="32" w16cid:durableId="1342664619">
     <w:abstractNumId w:val="11"/>
   </w:num>
   <w:num w:numId="33" w16cid:durableId="824473688">
-    <w:abstractNumId w:val="33"/>
+    <w:abstractNumId w:val="34"/>
   </w:num>
   <w:num w:numId="34" w16cid:durableId="757990035">
     <w:abstractNumId w:val="8"/>
@@ -2886,6 +3180,9 @@
   </w:num>
   <w:num w:numId="44" w16cid:durableId="1771655670">
     <w:abstractNumId w:val="13"/>
+  </w:num>
+  <w:num w:numId="45" w16cid:durableId="309480888">
+    <w:abstractNumId w:val="33"/>
   </w:num>
 </w:numbering>
 </file>

</xml_diff>